<commit_message>
Add real Wireshark capture screenshots to report
Co-Authored-By: Claude Sonnet 5.5 <noreply@anthropic.com>
Claude-Session: https://claude.ai/code/session_01NX2zRNpdVAnzFNKmqomzKu
</commit_message>
<xml_diff>
--- a/docs/final/RUDP_Final_Project_Report.docx
+++ b/docs/final/RUDP_Final_Project_Report.docx
@@ -12885,6 +12885,20 @@
     </w:p>
     <w:p>
       <w:pPr>
+        <w:spacing w:after="120" w:line="360"/>
+        <w:jc w:val="both"/>
+      </w:pPr>
+      <w:r>
+        <w:rPr>
+          <w:rFonts w:ascii="Times New Roman" w:cs="Times New Roman" w:eastAsia="Times New Roman" w:hAnsi="Times New Roman"/>
+          <w:sz w:val="24"/>
+          <w:szCs w:val="24"/>
+        </w:rPr>
+        <w:t xml:space="preserve">Figure 28 is a real capture of the client and server on the loopback interface (rudp_capture_loss.pcapng, 164 packets) taken with tshark while packet loss was applied, and opened in Wireshark with the dissector. The first three packets are the three-way handshake (SYN, SYN-ACK, ACK), and the expanded header of the SYN shows the sequence number, acknowledgment number, flags (0x01), checksum and payload length decoded field by field. In Figure 29, the filter smartrudp.seq == 1327198699 shows the same data segment twice: once at 0.0004 s and again at 0.501 s. The segment before it was lost, so the receiver kept acknowledging the same number, the sender timed out after 500 ms and resent the whole window (Go-Back-N), which is the retransmission behaviour described in Section 3.4.</w:t>
+      </w:r>
+    </w:p>
+    <w:p>
+      <w:pPr>
         <w:keepNext/>
         <w:spacing w:after="60" w:before="120"/>
         <w:jc w:val="center"/>
@@ -12892,9 +12906,9 @@
       <w:r>
         <w:drawing>
           <wp:inline distT="0" distB="0" distL="0" distR="0">
-            <wp:extent cx="5715000" cy="1971675"/>
+            <wp:extent cx="5715000" cy="6629400"/>
             <wp:effectExtent t="0" r="0" b="0" l="0"/>
-            <wp:docPr id="1" name="fig28" descr="Sequence-against-time view built from the exported traces of a 400-packet transfer over the lossy-wireless path: first copies of data, retransmissions and the cumulative ACK for AIMD (left) and Smart-RUDP (right)" title="Figure 28"/>
+            <wp:docPr id="1" name="fig28" descr="Real loopback capture opened with the RUDP dissector: SYN, SYN-ACK and ACK, with the header of the SYN decoded" title="Figure 28"/>
             <wp:cNvGraphicFramePr>
               <a:graphicFrameLocks xmlns:a="http://schemas.openxmlformats.org/drawingml/2006/main" noChangeAspect="1"/>
             </wp:cNvGraphicFramePr>
@@ -12917,6 +12931,152 @@
                   <pic:spPr bwMode="auto">
                     <a:xfrm>
                       <a:off x="0" y="0"/>
+                      <a:ext cx="5715000" cy="6629400"/>
+                    </a:xfrm>
+                    <a:prstGeom prst="rect">
+                      <a:avLst/>
+                    </a:prstGeom>
+                  </pic:spPr>
+                </pic:pic>
+              </a:graphicData>
+            </a:graphic>
+          </wp:inline>
+        </w:drawing>
+      </w:r>
+    </w:p>
+    <w:p>
+      <w:pPr>
+        <w:spacing w:after="200" w:line="276"/>
+        <w:jc w:val="center"/>
+      </w:pPr>
+      <w:r>
+        <w:rPr>
+          <w:rFonts w:ascii="Times New Roman" w:cs="Times New Roman" w:eastAsia="Times New Roman" w:hAnsi="Times New Roman"/>
+          <w:b/>
+          <w:bCs/>
+          <w:sz w:val="24"/>
+          <w:szCs w:val="24"/>
+        </w:rPr>
+        <w:t xml:space="preserve">Figure 28: </w:t>
+      </w:r>
+      <w:r>
+        <w:rPr>
+          <w:rFonts w:ascii="Times New Roman" w:cs="Times New Roman" w:eastAsia="Times New Roman" w:hAnsi="Times New Roman"/>
+          <w:i/>
+          <w:iCs/>
+          <w:sz w:val="24"/>
+          <w:szCs w:val="24"/>
+        </w:rPr>
+        <w:t xml:space="preserve">Real loopback capture opened with the RUDP dissector: SYN, SYN-ACK and ACK, with the header of the SYN decoded</w:t>
+      </w:r>
+    </w:p>
+    <w:p>
+      <w:pPr>
+        <w:keepNext/>
+        <w:spacing w:after="60" w:before="120"/>
+        <w:jc w:val="center"/>
+      </w:pPr>
+      <w:r>
+        <w:drawing>
+          <wp:inline distT="0" distB="0" distL="0" distR="0">
+            <wp:extent cx="5715000" cy="3571875"/>
+            <wp:effectExtent t="0" r="0" b="0" l="0"/>
+            <wp:docPr id="1" name="fig29" descr="Display filter smartrudp.seq == 1327198699: the same data segment sent at 0.0004 s and resent at 0.501 s after a timeout" title="Figure 29"/>
+            <wp:cNvGraphicFramePr>
+              <a:graphicFrameLocks xmlns:a="http://schemas.openxmlformats.org/drawingml/2006/main" noChangeAspect="1"/>
+            </wp:cNvGraphicFramePr>
+            <a:graphic xmlns:a="http://schemas.openxmlformats.org/drawingml/2006/main">
+              <a:graphicData uri="http://schemas.openxmlformats.org/drawingml/2006/picture">
+                <pic:pic xmlns:pic="http://schemas.openxmlformats.org/drawingml/2006/picture">
+                  <pic:nvPicPr>
+                    <pic:cNvPr id="0" name="" descr=""/>
+                    <pic:cNvPicPr>
+                      <a:picLocks noChangeAspect="1" noChangeArrowheads="1"/>
+                    </pic:cNvPicPr>
+                  </pic:nvPicPr>
+                  <pic:blipFill>
+                    <a:blip r:embed="rId36" cstate="none"/>
+                    <a:srcRect/>
+                    <a:stretch>
+                      <a:fillRect/>
+                    </a:stretch>
+                  </pic:blipFill>
+                  <pic:spPr bwMode="auto">
+                    <a:xfrm>
+                      <a:off x="0" y="0"/>
+                      <a:ext cx="5715000" cy="3571875"/>
+                    </a:xfrm>
+                    <a:prstGeom prst="rect">
+                      <a:avLst/>
+                    </a:prstGeom>
+                  </pic:spPr>
+                </pic:pic>
+              </a:graphicData>
+            </a:graphic>
+          </wp:inline>
+        </w:drawing>
+      </w:r>
+    </w:p>
+    <w:p>
+      <w:pPr>
+        <w:spacing w:after="200" w:line="276"/>
+        <w:jc w:val="center"/>
+      </w:pPr>
+      <w:r>
+        <w:rPr>
+          <w:rFonts w:ascii="Times New Roman" w:cs="Times New Roman" w:eastAsia="Times New Roman" w:hAnsi="Times New Roman"/>
+          <w:b/>
+          <w:bCs/>
+          <w:sz w:val="24"/>
+          <w:szCs w:val="24"/>
+        </w:rPr>
+        <w:t xml:space="preserve">Figure 29: </w:t>
+      </w:r>
+      <w:r>
+        <w:rPr>
+          <w:rFonts w:ascii="Times New Roman" w:cs="Times New Roman" w:eastAsia="Times New Roman" w:hAnsi="Times New Roman"/>
+          <w:i/>
+          <w:iCs/>
+          <w:sz w:val="24"/>
+          <w:szCs w:val="24"/>
+        </w:rPr>
+        <w:t xml:space="preserve">Display filter smartrudp.seq == 1327198699: the same data segment sent at 0.0004 s and resent at 0.501 s after a timeout</w:t>
+      </w:r>
+    </w:p>
+    <w:p>
+      <w:pPr>
+        <w:keepNext/>
+        <w:spacing w:after="60" w:before="120"/>
+        <w:jc w:val="center"/>
+      </w:pPr>
+      <w:r>
+        <w:drawing>
+          <wp:inline distT="0" distB="0" distL="0" distR="0">
+            <wp:extent cx="5715000" cy="1971675"/>
+            <wp:effectExtent t="0" r="0" b="0" l="0"/>
+            <wp:docPr id="1" name="fig30" descr="Sequence-against-time view built from the exported traces of a 400-packet transfer over the lossy-wireless path: first copies of data, retransmissions and the cumulative ACK for AIMD (left) and Smart-RUDP (right)" title="Figure 30"/>
+            <wp:cNvGraphicFramePr>
+              <a:graphicFrameLocks xmlns:a="http://schemas.openxmlformats.org/drawingml/2006/main" noChangeAspect="1"/>
+            </wp:cNvGraphicFramePr>
+            <a:graphic xmlns:a="http://schemas.openxmlformats.org/drawingml/2006/main">
+              <a:graphicData uri="http://schemas.openxmlformats.org/drawingml/2006/picture">
+                <pic:pic xmlns:pic="http://schemas.openxmlformats.org/drawingml/2006/picture">
+                  <pic:nvPicPr>
+                    <pic:cNvPr id="0" name="" descr=""/>
+                    <pic:cNvPicPr>
+                      <a:picLocks noChangeAspect="1" noChangeArrowheads="1"/>
+                    </pic:cNvPicPr>
+                  </pic:nvPicPr>
+                  <pic:blipFill>
+                    <a:blip r:embed="rId37" cstate="none"/>
+                    <a:srcRect/>
+                    <a:stretch>
+                      <a:fillRect/>
+                    </a:stretch>
+                  </pic:blipFill>
+                  <pic:spPr bwMode="auto">
+                    <a:xfrm>
+                      <a:off x="0" y="0"/>
                       <a:ext cx="5715000" cy="1971675"/>
                     </a:xfrm>
                     <a:prstGeom prst="rect">
@@ -12943,7 +13103,7 @@
           <w:sz w:val="24"/>
           <w:szCs w:val="24"/>
         </w:rPr>
-        <w:t xml:space="preserve">Figure 28: </w:t>
+        <w:t xml:space="preserve">Figure 30: </w:t>
       </w:r>
       <w:r>
         <w:rPr>
@@ -12967,7 +13127,7 @@
           <w:sz w:val="24"/>
           <w:szCs w:val="24"/>
         </w:rPr>
-        <w:t xml:space="preserve">Figure 28 plots the two traces in the style of a Wireshark time-sequence graph. In this run the receiver saw 487 data segments and 487 acknowledgments for the AIMD flow, of which 87 data segments carried a sequence number already seen, and 495 data segments and 495 acknowledgments for the Smart-RUDP flow, of which 95 were repeats. The staircase of repeated points shows Go-Back-N resending a window after each loss. The two flows delivered the same 400 packets; the counts are from a single run, are counted at the receiver (segments lost on the path are not visible), and are not a statistical comparison.</w:t>
+        <w:t xml:space="preserve">Figure 30 plots the two traces in the style of a Wireshark time-sequence graph. In this run the receiver saw 487 data segments and 487 acknowledgments for the AIMD flow, of which 87 data segments carried a sequence number already seen, and 495 data segments and 495 acknowledgments for the Smart-RUDP flow, of which 95 were repeats. The staircase of repeated points shows Go-Back-N resending a window after each loss. The two flows delivered the same 400 packets; the counts are from a single run, are counted at the receiver (segments lost on the path are not visible), and are not a statistical comparison.</w:t>
       </w:r>
     </w:p>
     <w:p>

</xml_diff>

<commit_message>
Report and deck: add RUDP Chat section and slide
Co-Authored-By: Claude Sonnet 5.5 <noreply@anthropic.com>
Claude-Session: https://claude.ai/code/session_01NX2zRNpdVAnzFNKmqomzKu
</commit_message>
<xml_diff>
--- a/docs/final/RUDP_Final_Project_Report.docx
+++ b/docs/final/RUDP_Final_Project_Report.docx
@@ -13144,7 +13144,153 @@
           <w:sz w:val="24"/>
           <w:szCs w:val="24"/>
         </w:rPr>
-        <w:t xml:space="preserve">11. LIMITATIONS</w:t>
+        <w:t xml:space="preserve">11. APPLICATION DEMONSTRATION: RUDP CHAT</w:t>
+      </w:r>
+    </w:p>
+    <w:p>
+      <w:pPr>
+        <w:spacing w:after="120" w:line="360"/>
+        <w:jc w:val="both"/>
+      </w:pPr>
+      <w:r>
+        <w:rPr>
+          <w:rFonts w:ascii="Times New Roman" w:cs="Times New Roman" w:eastAsia="Times New Roman" w:hAnsi="Times New Roman"/>
+          <w:sz w:val="24"/>
+          <w:szCs w:val="24"/>
+        </w:rPr>
+        <w:t xml:space="preserve">To show what the protocol does for a user, a messenger was built on the same packet format in three forms. The terminal program (src/chat.c) is a symmetric peer: each message is one data segment with a sequence number, the receiver delivers messages strictly in order and answers with cumulative ACKs, and the sender keeps a Go-Back-N window of eight messages with a 300 ms timeout and fast retransmit on three duplicate ACKs. Packet loss is simulated on the sending side, so a user can watch a lost message being recovered while the conversation still arrives complete and in order.</w:t>
+      </w:r>
+    </w:p>
+    <w:p>
+      <w:pPr>
+        <w:spacing w:after="120" w:line="360"/>
+        <w:jc w:val="both"/>
+      </w:pPr>
+      <w:r>
+        <w:rPr>
+          <w:rFonts w:ascii="Times New Roman" w:cs="Times New Roman" w:eastAsia="Times New Roman" w:hAnsi="Times New Roman"/>
+          <w:sz w:val="24"/>
+          <w:szCs w:val="24"/>
+        </w:rPr>
+        <w:t xml:space="preserve">The program was then extended to run between two machines. The peer is given as ip:port, the socket binds to all interfaces, and each side sends small acknowledgment packets to the other until the first packet arrives, which opens the return path through home routers (NAT); the peer address is then learned from the first valid packet. The two ends were connected over a Tailscale private network, one on the laptop and one on an Android phone.</w:t>
+      </w:r>
+    </w:p>
+    <w:p>
+      <w:pPr>
+        <w:spacing w:after="120" w:line="360"/>
+        <w:jc w:val="both"/>
+      </w:pPr>
+      <w:r>
+        <w:rPr>
+          <w:rFonts w:ascii="Times New Roman" w:cs="Times New Roman" w:eastAsia="Times New Roman" w:hAnsi="Times New Roman"/>
+          <w:sz w:val="24"/>
+          <w:szCs w:val="24"/>
+        </w:rPr>
+        <w:t xml:space="preserve">Finally, a browser front end was added (web/rudp_web.py and web/index.html). A browser cannot send raw UDP, so a small gateway written in Python with only the standard library implements the same RUDP rules and serves the chat page over local HTTP. It interoperates with the C program: in a test with 30% simulated loss in both directions, messages from the browser and from the terminal peer all arrived once and in order. The page, shown in Figure 31, marks each sent message as delivered once it is acknowledged and shows a live loss slider, counts of packets sent, lost and resent, the number of messages in flight, and a log of timeouts and fast retransmits.</w:t>
+      </w:r>
+    </w:p>
+    <w:p>
+      <w:pPr>
+        <w:keepNext/>
+        <w:spacing w:after="60" w:before="120"/>
+        <w:jc w:val="center"/>
+      </w:pPr>
+      <w:r>
+        <w:drawing>
+          <wp:inline distT="0" distB="0" distL="0" distR="0">
+            <wp:extent cx="5715000" cy="3324225"/>
+            <wp:effectExtent t="0" r="0" b="0" l="0"/>
+            <wp:docPr id="1" name="fig31" descr="RUDP Web Chat between two peers with 30% simulated packet loss: delivered ticks, packet counters, window state and protocol log." title="Figure 31"/>
+            <wp:cNvGraphicFramePr>
+              <a:graphicFrameLocks xmlns:a="http://schemas.openxmlformats.org/drawingml/2006/main" noChangeAspect="1"/>
+            </wp:cNvGraphicFramePr>
+            <a:graphic xmlns:a="http://schemas.openxmlformats.org/drawingml/2006/main">
+              <a:graphicData uri="http://schemas.openxmlformats.org/drawingml/2006/picture">
+                <pic:pic xmlns:pic="http://schemas.openxmlformats.org/drawingml/2006/picture">
+                  <pic:nvPicPr>
+                    <pic:cNvPr id="0" name="" descr=""/>
+                    <pic:cNvPicPr>
+                      <a:picLocks noChangeAspect="1" noChangeArrowheads="1"/>
+                    </pic:cNvPicPr>
+                  </pic:nvPicPr>
+                  <pic:blipFill>
+                    <a:blip r:embed="rId38" cstate="none"/>
+                    <a:srcRect/>
+                    <a:stretch>
+                      <a:fillRect/>
+                    </a:stretch>
+                  </pic:blipFill>
+                  <pic:spPr bwMode="auto">
+                    <a:xfrm>
+                      <a:off x="0" y="0"/>
+                      <a:ext cx="5715000" cy="3324225"/>
+                    </a:xfrm>
+                    <a:prstGeom prst="rect">
+                      <a:avLst/>
+                    </a:prstGeom>
+                  </pic:spPr>
+                </pic:pic>
+              </a:graphicData>
+            </a:graphic>
+          </wp:inline>
+        </w:drawing>
+      </w:r>
+    </w:p>
+    <w:p>
+      <w:pPr>
+        <w:spacing w:after="200" w:line="276"/>
+        <w:jc w:val="center"/>
+      </w:pPr>
+      <w:r>
+        <w:rPr>
+          <w:rFonts w:ascii="Times New Roman" w:cs="Times New Roman" w:eastAsia="Times New Roman" w:hAnsi="Times New Roman"/>
+          <w:b/>
+          <w:bCs/>
+          <w:sz w:val="24"/>
+          <w:szCs w:val="24"/>
+        </w:rPr>
+        <w:t xml:space="preserve">Figure 31: </w:t>
+      </w:r>
+      <w:r>
+        <w:rPr>
+          <w:rFonts w:ascii="Times New Roman" w:cs="Times New Roman" w:eastAsia="Times New Roman" w:hAnsi="Times New Roman"/>
+          <w:i/>
+          <w:iCs/>
+          <w:sz w:val="24"/>
+          <w:szCs w:val="24"/>
+        </w:rPr>
+        <w:t xml:space="preserve">RUDP Web Chat between two peers with 30% simulated packet loss: delivered ticks, packet counters, window state and protocol log.</w:t>
+      </w:r>
+    </w:p>
+    <w:p>
+      <w:pPr>
+        <w:spacing w:after="120" w:line="360"/>
+        <w:jc w:val="both"/>
+      </w:pPr>
+      <w:r>
+        <w:rPr>
+          <w:rFonts w:ascii="Times New Roman" w:cs="Times New Roman" w:eastAsia="Times New Roman" w:hAnsi="Times New Roman"/>
+          <w:sz w:val="24"/>
+          <w:szCs w:val="24"/>
+        </w:rPr>
+        <w:t xml:space="preserve">This demonstration is an application of the protocol, not a new measurement. It uses a fixed window of eight and does not use the Smart-RUDP controller. Over the internet the result also depends on the network between the peers: direct connections between two home networks usually work, but shared or carrier-grade NAT, as on many hostel networks, can block them, which is why the private-network route was used.</w:t>
+      </w:r>
+    </w:p>
+    <w:p>
+      <w:pPr>
+        <w:pStyle w:val="Heading1"/>
+        <w:keepNext/>
+        <w:spacing w:after="120" w:before="240" w:line="360"/>
+      </w:pPr>
+      <w:r>
+        <w:rPr>
+          <w:rFonts w:ascii="Times New Roman" w:cs="Times New Roman" w:eastAsia="Times New Roman" w:hAnsi="Times New Roman"/>
+          <w:b/>
+          <w:bCs/>
+          <w:sz w:val="24"/>
+          <w:szCs w:val="24"/>
+        </w:rPr>
+        <w:t xml:space="preserve">12. LIMITATIONS</w:t>
       </w:r>
     </w:p>
     <w:p>
@@ -13335,7 +13481,7 @@
           <w:sz w:val="24"/>
           <w:szCs w:val="24"/>
         </w:rPr>
-        <w:t xml:space="preserve">12. CONCLUSION AND FUTURE ENHANCEMENTS</w:t>
+        <w:t xml:space="preserve">13. CONCLUSION AND FUTURE ENHANCEMENTS</w:t>
       </w:r>
     </w:p>
     <w:p>

</xml_diff>

<commit_message>
Update chat screenshot in report and deck
</commit_message>
<xml_diff>
--- a/docs/final/RUDP_Final_Project_Report.docx
+++ b/docs/final/RUDP_Final_Project_Report.docx
@@ -13198,9 +13198,9 @@
       <w:r>
         <w:drawing>
           <wp:inline distT="0" distB="0" distL="0" distR="0">
-            <wp:extent cx="5715000" cy="3324225"/>
+            <wp:extent cx="5715000" cy="3533775"/>
             <wp:effectExtent t="0" r="0" b="0" l="0"/>
-            <wp:docPr id="1" name="fig31" descr="RUDP Web Chat between two peers with 30% simulated packet loss: delivered ticks, packet counters, window state and protocol log." title="Figure 31"/>
+            <wp:docPr id="1" name="fig31" descr="RUDP Web Chat with the Smart-RUDP controller selected, after a 60-message test at 10% simulated loss and 40 ms emulated delay: delivered ticks, packet counters, window controller and protocol log." title="Figure 31"/>
             <wp:cNvGraphicFramePr>
               <a:graphicFrameLocks xmlns:a="http://schemas.openxmlformats.org/drawingml/2006/main" noChangeAspect="1"/>
             </wp:cNvGraphicFramePr>
@@ -13223,7 +13223,7 @@
                   <pic:spPr bwMode="auto">
                     <a:xfrm>
                       <a:off x="0" y="0"/>
-                      <a:ext cx="5715000" cy="3324225"/>
+                      <a:ext cx="5715000" cy="3533775"/>
                     </a:xfrm>
                     <a:prstGeom prst="rect">
                       <a:avLst/>
@@ -13259,7 +13259,7 @@
           <w:sz w:val="24"/>
           <w:szCs w:val="24"/>
         </w:rPr>
-        <w:t xml:space="preserve">RUDP Web Chat between two peers with 30% simulated packet loss: delivered ticks, packet counters, window state and protocol log.</w:t>
+        <w:t xml:space="preserve">RUDP Web Chat with the Smart-RUDP controller selected, after a 60-message test at 10% simulated loss and 40 ms emulated delay: delivered ticks, packet counters, window controller and protocol log.</w:t>
       </w:r>
     </w:p>
     <w:p>

</xml_diff>

<commit_message>
Smart-RUDP for chat: shared controller module, simulator, offline training (q_chat.txt), held-out evaluation; docs updated
Co-Authored-By: Claude Sonnet 5.5 <noreply@anthropic.com>
Claude-Session: https://claude.ai/code/session_01NX2zRNpdVAnzFNKmqomzKu
</commit_message>
<xml_diff>
--- a/docs/final/RUDP_Final_Project_Report.docx
+++ b/docs/final/RUDP_Final_Project_Report.docx
@@ -13273,7 +13273,1279 @@
           <w:sz w:val="24"/>
           <w:szCs w:val="24"/>
         </w:rPr>
-        <w:t xml:space="preserve">The web page also lets the user choose the window controller: a fixed window of eight, the AIMD rule, or the Smart-RUDP Q-learning agent, which loads the trained table from the experiments and keeps learning while the chat runs. A button sends 60 test messages and reports how long delivery took. In local tests with four runs per controller, delivery of 60 messages took 0.8 to 0.9 s for the fixed window and 1.8 to 2.1 s for AIMD at 10% loss and 40 ms of emulated one-way delay; at 2% loss and 100 ms it took 1.7 to 2.1 s for the fixed window and 0.9 to 3.6 s for AIMD. Smart-RUDP ranged from 0.6 to 2.7 s on the first path and 1.2 to 3.4 s on the second, with the agent still adapting to paths it was not trained on. There was no consistent winner and the run-to-run spread is as large as the differences, which agrees with the result of Section 8: the learned controller works inside the application but does not clearly beat the simple rules. This demonstration is an application of the protocol, not a new measurement. Over the internet the result also depends on the network between the peers: direct connections between two home networks usually work, but shared or carrier-grade NAT, as on many hostel networks, can block them, which is why the private-network route was used.</w:t>
+        <w:t xml:space="preserve">The web page also lets the user choose the window controller: a fixed window of eight, the AIMD rule, or the Smart-RUDP Q-learning agent. A button sends 60 test messages and reports how long delivery took. The chat is a different setting from the experiments of Section 8: traffic comes in short bursts and the loss on the path is random rather than caused by a full queue. The Smart-RUDP agent for the chat was therefore retrained (web/train.py) on a discrete-event simulator of the chat transport (web/sim.py), over 6,000 randomly drawn paths with 0 to 15% loss, 20 to 150 ms one-way delay and an optional bottleneck link. Two choices are worth stating. First, AIMD and Smart-RUDP start from the same initial window of 10 (RFC 6928), so neither gets a head start. Second, the agent may not shrink the window while there is neither loss nor delay growth; with this rule removed the trained agent was slower than AIMD on every path, so it is part of the design and not a detail. The agents were evaluated frozen and greedy on six held-out paths and 60 random seeds each; Table 11 gives the mean time to deliver 60 messages.</w:t>
+      </w:r>
+    </w:p>
+    <w:p>
+      <w:pPr>
+        <w:keepNext/>
+        <w:spacing w:after="80" w:before="120"/>
+        <w:jc w:val="center"/>
+      </w:pPr>
+      <w:r>
+        <w:rPr>
+          <w:rFonts w:ascii="Times New Roman" w:cs="Times New Roman" w:eastAsia="Times New Roman" w:hAnsi="Times New Roman"/>
+          <w:b/>
+          <w:bCs/>
+          <w:sz w:val="24"/>
+          <w:szCs w:val="24"/>
+        </w:rPr>
+        <w:t xml:space="preserve">Table 11: Mean time to deliver 60 chat messages on simulated held-out paths (60 seeds each; lower is better)</w:t>
+      </w:r>
+    </w:p>
+    <w:tbl>
+      <w:tblPr>
+        <w:tblW w:type="dxa" w:w="9026"/>
+        <w:tblBorders>
+          <w:top w:val="single" w:color="auto" w:sz="4"/>
+          <w:left w:val="single" w:color="auto" w:sz="4"/>
+          <w:bottom w:val="single" w:color="auto" w:sz="4"/>
+          <w:right w:val="single" w:color="auto" w:sz="4"/>
+          <w:insideH w:val="single" w:color="auto" w:sz="4"/>
+          <w:insideV w:val="single" w:color="auto" w:sz="4"/>
+        </w:tblBorders>
+      </w:tblPr>
+      <w:tblGrid>
+        <w:gridCol w:w="3100"/>
+        <w:gridCol w:w="1500"/>
+        <w:gridCol w:w="1500"/>
+        <w:gridCol w:w="1600"/>
+        <w:gridCol w:w="1326"/>
+      </w:tblGrid>
+      <w:tr>
+        <w:trPr>
+          <w:cantSplit/>
+          <w:tblHeader/>
+        </w:trPr>
+        <w:tc>
+          <w:tcPr>
+            <w:tcW w:type="dxa" w:w="3100"/>
+            <w:tcBorders>
+              <w:top w:val="single" w:color="000000" w:sz="4"/>
+              <w:left w:val="single" w:color="000000" w:sz="4"/>
+              <w:bottom w:val="single" w:color="000000" w:sz="4"/>
+              <w:right w:val="single" w:color="000000" w:sz="4"/>
+            </w:tcBorders>
+            <w:shd w:fill="D9D9D9" w:color="auto" w:val="clear"/>
+            <w:tcMar>
+              <w:top w:type="dxa" w:w="60"/>
+              <w:left w:type="dxa" w:w="100"/>
+              <w:bottom w:type="dxa" w:w="60"/>
+              <w:right w:type="dxa" w:w="100"/>
+            </w:tcMar>
+          </w:tcPr>
+          <w:p>
+            <w:pPr>
+              <w:spacing w:line="276"/>
+              <w:jc w:val="left"/>
+            </w:pPr>
+            <w:r>
+              <w:rPr>
+                <w:rFonts w:ascii="Times New Roman" w:cs="Times New Roman" w:eastAsia="Times New Roman" w:hAnsi="Times New Roman"/>
+                <w:b/>
+                <w:bCs/>
+                <w:sz w:val="24"/>
+                <w:szCs w:val="24"/>
+              </w:rPr>
+              <w:t xml:space="preserve">Path (one-way delay)</w:t>
+            </w:r>
+          </w:p>
+        </w:tc>
+        <w:tc>
+          <w:tcPr>
+            <w:tcW w:type="dxa" w:w="1500"/>
+            <w:tcBorders>
+              <w:top w:val="single" w:color="000000" w:sz="4"/>
+              <w:left w:val="single" w:color="000000" w:sz="4"/>
+              <w:bottom w:val="single" w:color="000000" w:sz="4"/>
+              <w:right w:val="single" w:color="000000" w:sz="4"/>
+            </w:tcBorders>
+            <w:shd w:fill="D9D9D9" w:color="auto" w:val="clear"/>
+            <w:tcMar>
+              <w:top w:type="dxa" w:w="60"/>
+              <w:left w:type="dxa" w:w="100"/>
+              <w:bottom w:type="dxa" w:w="60"/>
+              <w:right w:type="dxa" w:w="100"/>
+            </w:tcMar>
+          </w:tcPr>
+          <w:p>
+            <w:pPr>
+              <w:spacing w:line="276"/>
+              <w:jc w:val="left"/>
+            </w:pPr>
+            <w:r>
+              <w:rPr>
+                <w:rFonts w:ascii="Times New Roman" w:cs="Times New Roman" w:eastAsia="Times New Roman" w:hAnsi="Times New Roman"/>
+                <w:b/>
+                <w:bCs/>
+                <w:sz w:val="24"/>
+                <w:szCs w:val="24"/>
+              </w:rPr>
+              <w:t xml:space="preserve">Fixed 8</w:t>
+            </w:r>
+          </w:p>
+        </w:tc>
+        <w:tc>
+          <w:tcPr>
+            <w:tcW w:type="dxa" w:w="1500"/>
+            <w:tcBorders>
+              <w:top w:val="single" w:color="000000" w:sz="4"/>
+              <w:left w:val="single" w:color="000000" w:sz="4"/>
+              <w:bottom w:val="single" w:color="000000" w:sz="4"/>
+              <w:right w:val="single" w:color="000000" w:sz="4"/>
+            </w:tcBorders>
+            <w:shd w:fill="D9D9D9" w:color="auto" w:val="clear"/>
+            <w:tcMar>
+              <w:top w:type="dxa" w:w="60"/>
+              <w:left w:type="dxa" w:w="100"/>
+              <w:bottom w:type="dxa" w:w="60"/>
+              <w:right w:type="dxa" w:w="100"/>
+            </w:tcMar>
+          </w:tcPr>
+          <w:p>
+            <w:pPr>
+              <w:spacing w:line="276"/>
+              <w:jc w:val="left"/>
+            </w:pPr>
+            <w:r>
+              <w:rPr>
+                <w:rFonts w:ascii="Times New Roman" w:cs="Times New Roman" w:eastAsia="Times New Roman" w:hAnsi="Times New Roman"/>
+                <w:b/>
+                <w:bCs/>
+                <w:sz w:val="24"/>
+                <w:szCs w:val="24"/>
+              </w:rPr>
+              <w:t xml:space="preserve">AIMD</w:t>
+            </w:r>
+          </w:p>
+        </w:tc>
+        <w:tc>
+          <w:tcPr>
+            <w:tcW w:type="dxa" w:w="1600"/>
+            <w:tcBorders>
+              <w:top w:val="single" w:color="000000" w:sz="4"/>
+              <w:left w:val="single" w:color="000000" w:sz="4"/>
+              <w:bottom w:val="single" w:color="000000" w:sz="4"/>
+              <w:right w:val="single" w:color="000000" w:sz="4"/>
+            </w:tcBorders>
+            <w:shd w:fill="D9D9D9" w:color="auto" w:val="clear"/>
+            <w:tcMar>
+              <w:top w:type="dxa" w:w="60"/>
+              <w:left w:type="dxa" w:w="100"/>
+              <w:bottom w:type="dxa" w:w="60"/>
+              <w:right w:type="dxa" w:w="100"/>
+            </w:tcMar>
+          </w:tcPr>
+          <w:p>
+            <w:pPr>
+              <w:spacing w:line="276"/>
+              <w:jc w:val="left"/>
+            </w:pPr>
+            <w:r>
+              <w:rPr>
+                <w:rFonts w:ascii="Times New Roman" w:cs="Times New Roman" w:eastAsia="Times New Roman" w:hAnsi="Times New Roman"/>
+                <w:b/>
+                <w:bCs/>
+                <w:sz w:val="24"/>
+                <w:szCs w:val="24"/>
+              </w:rPr>
+              <w:t xml:space="preserve">Smart-RUDP</w:t>
+            </w:r>
+          </w:p>
+        </w:tc>
+        <w:tc>
+          <w:tcPr>
+            <w:tcW w:type="dxa" w:w="1326"/>
+            <w:tcBorders>
+              <w:top w:val="single" w:color="000000" w:sz="4"/>
+              <w:left w:val="single" w:color="000000" w:sz="4"/>
+              <w:bottom w:val="single" w:color="000000" w:sz="4"/>
+              <w:right w:val="single" w:color="000000" w:sz="4"/>
+            </w:tcBorders>
+            <w:shd w:fill="D9D9D9" w:color="auto" w:val="clear"/>
+            <w:tcMar>
+              <w:top w:type="dxa" w:w="60"/>
+              <w:left w:type="dxa" w:w="100"/>
+              <w:bottom w:type="dxa" w:w="60"/>
+              <w:right w:type="dxa" w:w="100"/>
+            </w:tcMar>
+          </w:tcPr>
+          <w:p>
+            <w:pPr>
+              <w:spacing w:line="276"/>
+              <w:jc w:val="left"/>
+            </w:pPr>
+            <w:r>
+              <w:rPr>
+                <w:rFonts w:ascii="Times New Roman" w:cs="Times New Roman" w:eastAsia="Times New Roman" w:hAnsi="Times New Roman"/>
+                <w:b/>
+                <w:bCs/>
+                <w:sz w:val="24"/>
+                <w:szCs w:val="24"/>
+              </w:rPr>
+              <w:t xml:space="preserve">Smart vs AIMD</w:t>
+            </w:r>
+          </w:p>
+        </w:tc>
+      </w:tr>
+      <w:tr>
+        <w:trPr>
+          <w:cantSplit/>
+          <w:tblHeader w:val="false"/>
+        </w:trPr>
+        <w:tc>
+          <w:tcPr>
+            <w:tcW w:type="dxa" w:w="3100"/>
+            <w:tcBorders>
+              <w:top w:val="single" w:color="000000" w:sz="4"/>
+              <w:left w:val="single" w:color="000000" w:sz="4"/>
+              <w:bottom w:val="single" w:color="000000" w:sz="4"/>
+              <w:right w:val="single" w:color="000000" w:sz="4"/>
+            </w:tcBorders>
+            <w:tcMar>
+              <w:top w:type="dxa" w:w="60"/>
+              <w:left w:type="dxa" w:w="100"/>
+              <w:bottom w:type="dxa" w:w="60"/>
+              <w:right w:type="dxa" w:w="100"/>
+            </w:tcMar>
+          </w:tcPr>
+          <w:p>
+            <w:pPr>
+              <w:spacing w:line="276"/>
+              <w:jc w:val="left"/>
+            </w:pPr>
+            <w:r>
+              <w:rPr>
+                <w:rFonts w:ascii="Times New Roman" w:cs="Times New Roman" w:eastAsia="Times New Roman" w:hAnsi="Times New Roman"/>
+                <w:b w:val="false"/>
+                <w:bCs w:val="false"/>
+                <w:sz w:val="24"/>
+                <w:szCs w:val="24"/>
+              </w:rPr>
+              <w:t xml:space="preserve">10% loss, 40 ms</w:t>
+            </w:r>
+          </w:p>
+        </w:tc>
+        <w:tc>
+          <w:tcPr>
+            <w:tcW w:type="dxa" w:w="1500"/>
+            <w:tcBorders>
+              <w:top w:val="single" w:color="000000" w:sz="4"/>
+              <w:left w:val="single" w:color="000000" w:sz="4"/>
+              <w:bottom w:val="single" w:color="000000" w:sz="4"/>
+              <w:right w:val="single" w:color="000000" w:sz="4"/>
+            </w:tcBorders>
+            <w:tcMar>
+              <w:top w:type="dxa" w:w="60"/>
+              <w:left w:type="dxa" w:w="100"/>
+              <w:bottom w:type="dxa" w:w="60"/>
+              <w:right w:type="dxa" w:w="100"/>
+            </w:tcMar>
+          </w:tcPr>
+          <w:p>
+            <w:pPr>
+              <w:spacing w:line="276"/>
+              <w:jc w:val="left"/>
+            </w:pPr>
+            <w:r>
+              <w:rPr>
+                <w:rFonts w:ascii="Times New Roman" w:cs="Times New Roman" w:eastAsia="Times New Roman" w:hAnsi="Times New Roman"/>
+                <w:b w:val="false"/>
+                <w:bCs w:val="false"/>
+                <w:sz w:val="24"/>
+                <w:szCs w:val="24"/>
+              </w:rPr>
+              <w:t xml:space="preserve">1.09 s</w:t>
+            </w:r>
+          </w:p>
+        </w:tc>
+        <w:tc>
+          <w:tcPr>
+            <w:tcW w:type="dxa" w:w="1500"/>
+            <w:tcBorders>
+              <w:top w:val="single" w:color="000000" w:sz="4"/>
+              <w:left w:val="single" w:color="000000" w:sz="4"/>
+              <w:bottom w:val="single" w:color="000000" w:sz="4"/>
+              <w:right w:val="single" w:color="000000" w:sz="4"/>
+            </w:tcBorders>
+            <w:tcMar>
+              <w:top w:type="dxa" w:w="60"/>
+              <w:left w:type="dxa" w:w="100"/>
+              <w:bottom w:type="dxa" w:w="60"/>
+              <w:right w:type="dxa" w:w="100"/>
+            </w:tcMar>
+          </w:tcPr>
+          <w:p>
+            <w:pPr>
+              <w:spacing w:line="276"/>
+              <w:jc w:val="left"/>
+            </w:pPr>
+            <w:r>
+              <w:rPr>
+                <w:rFonts w:ascii="Times New Roman" w:cs="Times New Roman" w:eastAsia="Times New Roman" w:hAnsi="Times New Roman"/>
+                <w:b w:val="false"/>
+                <w:bCs w:val="false"/>
+                <w:sz w:val="24"/>
+                <w:szCs w:val="24"/>
+              </w:rPr>
+              <w:t xml:space="preserve">2.17 s</w:t>
+            </w:r>
+          </w:p>
+        </w:tc>
+        <w:tc>
+          <w:tcPr>
+            <w:tcW w:type="dxa" w:w="1600"/>
+            <w:tcBorders>
+              <w:top w:val="single" w:color="000000" w:sz="4"/>
+              <w:left w:val="single" w:color="000000" w:sz="4"/>
+              <w:bottom w:val="single" w:color="000000" w:sz="4"/>
+              <w:right w:val="single" w:color="000000" w:sz="4"/>
+            </w:tcBorders>
+            <w:tcMar>
+              <w:top w:type="dxa" w:w="60"/>
+              <w:left w:type="dxa" w:w="100"/>
+              <w:bottom w:type="dxa" w:w="60"/>
+              <w:right w:type="dxa" w:w="100"/>
+            </w:tcMar>
+          </w:tcPr>
+          <w:p>
+            <w:pPr>
+              <w:spacing w:line="276"/>
+              <w:jc w:val="left"/>
+            </w:pPr>
+            <w:r>
+              <w:rPr>
+                <w:rFonts w:ascii="Times New Roman" w:cs="Times New Roman" w:eastAsia="Times New Roman" w:hAnsi="Times New Roman"/>
+                <w:b w:val="false"/>
+                <w:bCs w:val="false"/>
+                <w:sz w:val="24"/>
+                <w:szCs w:val="24"/>
+              </w:rPr>
+              <w:t xml:space="preserve">0.90 s</w:t>
+            </w:r>
+          </w:p>
+        </w:tc>
+        <w:tc>
+          <w:tcPr>
+            <w:tcW w:type="dxa" w:w="1326"/>
+            <w:tcBorders>
+              <w:top w:val="single" w:color="000000" w:sz="4"/>
+              <w:left w:val="single" w:color="000000" w:sz="4"/>
+              <w:bottom w:val="single" w:color="000000" w:sz="4"/>
+              <w:right w:val="single" w:color="000000" w:sz="4"/>
+            </w:tcBorders>
+            <w:tcMar>
+              <w:top w:type="dxa" w:w="60"/>
+              <w:left w:type="dxa" w:w="100"/>
+              <w:bottom w:type="dxa" w:w="60"/>
+              <w:right w:type="dxa" w:w="100"/>
+            </w:tcMar>
+          </w:tcPr>
+          <w:p>
+            <w:pPr>
+              <w:spacing w:line="276"/>
+              <w:jc w:val="left"/>
+            </w:pPr>
+            <w:r>
+              <w:rPr>
+                <w:rFonts w:ascii="Times New Roman" w:cs="Times New Roman" w:eastAsia="Times New Roman" w:hAnsi="Times New Roman"/>
+                <w:b w:val="false"/>
+                <w:bCs w:val="false"/>
+                <w:sz w:val="24"/>
+                <w:szCs w:val="24"/>
+              </w:rPr>
+              <w:t xml:space="preserve">faster</w:t>
+            </w:r>
+          </w:p>
+        </w:tc>
+      </w:tr>
+      <w:tr>
+        <w:trPr>
+          <w:cantSplit/>
+          <w:tblHeader w:val="false"/>
+        </w:trPr>
+        <w:tc>
+          <w:tcPr>
+            <w:tcW w:type="dxa" w:w="3100"/>
+            <w:tcBorders>
+              <w:top w:val="single" w:color="000000" w:sz="4"/>
+              <w:left w:val="single" w:color="000000" w:sz="4"/>
+              <w:bottom w:val="single" w:color="000000" w:sz="4"/>
+              <w:right w:val="single" w:color="000000" w:sz="4"/>
+            </w:tcBorders>
+            <w:tcMar>
+              <w:top w:type="dxa" w:w="60"/>
+              <w:left w:type="dxa" w:w="100"/>
+              <w:bottom w:type="dxa" w:w="60"/>
+              <w:right w:type="dxa" w:w="100"/>
+            </w:tcMar>
+          </w:tcPr>
+          <w:p>
+            <w:pPr>
+              <w:spacing w:line="276"/>
+              <w:jc w:val="left"/>
+            </w:pPr>
+            <w:r>
+              <w:rPr>
+                <w:rFonts w:ascii="Times New Roman" w:cs="Times New Roman" w:eastAsia="Times New Roman" w:hAnsi="Times New Roman"/>
+                <w:b w:val="false"/>
+                <w:bCs w:val="false"/>
+                <w:sz w:val="24"/>
+                <w:szCs w:val="24"/>
+              </w:rPr>
+              <w:t xml:space="preserve">2% loss, 100 ms</w:t>
+            </w:r>
+          </w:p>
+        </w:tc>
+        <w:tc>
+          <w:tcPr>
+            <w:tcW w:type="dxa" w:w="1500"/>
+            <w:tcBorders>
+              <w:top w:val="single" w:color="000000" w:sz="4"/>
+              <w:left w:val="single" w:color="000000" w:sz="4"/>
+              <w:bottom w:val="single" w:color="000000" w:sz="4"/>
+              <w:right w:val="single" w:color="000000" w:sz="4"/>
+            </w:tcBorders>
+            <w:tcMar>
+              <w:top w:type="dxa" w:w="60"/>
+              <w:left w:type="dxa" w:w="100"/>
+              <w:bottom w:type="dxa" w:w="60"/>
+              <w:right w:type="dxa" w:w="100"/>
+            </w:tcMar>
+          </w:tcPr>
+          <w:p>
+            <w:pPr>
+              <w:spacing w:line="276"/>
+              <w:jc w:val="left"/>
+            </w:pPr>
+            <w:r>
+              <w:rPr>
+                <w:rFonts w:ascii="Times New Roman" w:cs="Times New Roman" w:eastAsia="Times New Roman" w:hAnsi="Times New Roman"/>
+                <w:b w:val="false"/>
+                <w:bCs w:val="false"/>
+                <w:sz w:val="24"/>
+                <w:szCs w:val="24"/>
+              </w:rPr>
+              <w:t xml:space="preserve">1.77 s</w:t>
+            </w:r>
+          </w:p>
+        </w:tc>
+        <w:tc>
+          <w:tcPr>
+            <w:tcW w:type="dxa" w:w="1500"/>
+            <w:tcBorders>
+              <w:top w:val="single" w:color="000000" w:sz="4"/>
+              <w:left w:val="single" w:color="000000" w:sz="4"/>
+              <w:bottom w:val="single" w:color="000000" w:sz="4"/>
+              <w:right w:val="single" w:color="000000" w:sz="4"/>
+            </w:tcBorders>
+            <w:tcMar>
+              <w:top w:type="dxa" w:w="60"/>
+              <w:left w:type="dxa" w:w="100"/>
+              <w:bottom w:type="dxa" w:w="60"/>
+              <w:right w:type="dxa" w:w="100"/>
+            </w:tcMar>
+          </w:tcPr>
+          <w:p>
+            <w:pPr>
+              <w:spacing w:line="276"/>
+              <w:jc w:val="left"/>
+            </w:pPr>
+            <w:r>
+              <w:rPr>
+                <w:rFonts w:ascii="Times New Roman" w:cs="Times New Roman" w:eastAsia="Times New Roman" w:hAnsi="Times New Roman"/>
+                <w:b w:val="false"/>
+                <w:bCs w:val="false"/>
+                <w:sz w:val="24"/>
+                <w:szCs w:val="24"/>
+              </w:rPr>
+              <w:t xml:space="preserve">1.66 s</w:t>
+            </w:r>
+          </w:p>
+        </w:tc>
+        <w:tc>
+          <w:tcPr>
+            <w:tcW w:type="dxa" w:w="1600"/>
+            <w:tcBorders>
+              <w:top w:val="single" w:color="000000" w:sz="4"/>
+              <w:left w:val="single" w:color="000000" w:sz="4"/>
+              <w:bottom w:val="single" w:color="000000" w:sz="4"/>
+              <w:right w:val="single" w:color="000000" w:sz="4"/>
+            </w:tcBorders>
+            <w:tcMar>
+              <w:top w:type="dxa" w:w="60"/>
+              <w:left w:type="dxa" w:w="100"/>
+              <w:bottom w:type="dxa" w:w="60"/>
+              <w:right w:type="dxa" w:w="100"/>
+            </w:tcMar>
+          </w:tcPr>
+          <w:p>
+            <w:pPr>
+              <w:spacing w:line="276"/>
+              <w:jc w:val="left"/>
+            </w:pPr>
+            <w:r>
+              <w:rPr>
+                <w:rFonts w:ascii="Times New Roman" w:cs="Times New Roman" w:eastAsia="Times New Roman" w:hAnsi="Times New Roman"/>
+                <w:b w:val="false"/>
+                <w:bCs w:val="false"/>
+                <w:sz w:val="24"/>
+                <w:szCs w:val="24"/>
+              </w:rPr>
+              <w:t xml:space="preserve">1.43 s</w:t>
+            </w:r>
+          </w:p>
+        </w:tc>
+        <w:tc>
+          <w:tcPr>
+            <w:tcW w:type="dxa" w:w="1326"/>
+            <w:tcBorders>
+              <w:top w:val="single" w:color="000000" w:sz="4"/>
+              <w:left w:val="single" w:color="000000" w:sz="4"/>
+              <w:bottom w:val="single" w:color="000000" w:sz="4"/>
+              <w:right w:val="single" w:color="000000" w:sz="4"/>
+            </w:tcBorders>
+            <w:tcMar>
+              <w:top w:type="dxa" w:w="60"/>
+              <w:left w:type="dxa" w:w="100"/>
+              <w:bottom w:type="dxa" w:w="60"/>
+              <w:right w:type="dxa" w:w="100"/>
+            </w:tcMar>
+          </w:tcPr>
+          <w:p>
+            <w:pPr>
+              <w:spacing w:line="276"/>
+              <w:jc w:val="left"/>
+            </w:pPr>
+            <w:r>
+              <w:rPr>
+                <w:rFonts w:ascii="Times New Roman" w:cs="Times New Roman" w:eastAsia="Times New Roman" w:hAnsi="Times New Roman"/>
+                <w:b w:val="false"/>
+                <w:bCs w:val="false"/>
+                <w:sz w:val="24"/>
+                <w:szCs w:val="24"/>
+              </w:rPr>
+              <w:t xml:space="preserve">faster</w:t>
+            </w:r>
+          </w:p>
+        </w:tc>
+      </w:tr>
+      <w:tr>
+        <w:trPr>
+          <w:cantSplit/>
+          <w:tblHeader w:val="false"/>
+        </w:trPr>
+        <w:tc>
+          <w:tcPr>
+            <w:tcW w:type="dxa" w:w="3100"/>
+            <w:tcBorders>
+              <w:top w:val="single" w:color="000000" w:sz="4"/>
+              <w:left w:val="single" w:color="000000" w:sz="4"/>
+              <w:bottom w:val="single" w:color="000000" w:sz="4"/>
+              <w:right w:val="single" w:color="000000" w:sz="4"/>
+            </w:tcBorders>
+            <w:tcMar>
+              <w:top w:type="dxa" w:w="60"/>
+              <w:left w:type="dxa" w:w="100"/>
+              <w:bottom w:type="dxa" w:w="60"/>
+              <w:right w:type="dxa" w:w="100"/>
+            </w:tcMar>
+          </w:tcPr>
+          <w:p>
+            <w:pPr>
+              <w:spacing w:line="276"/>
+              <w:jc w:val="left"/>
+            </w:pPr>
+            <w:r>
+              <w:rPr>
+                <w:rFonts w:ascii="Times New Roman" w:cs="Times New Roman" w:eastAsia="Times New Roman" w:hAnsi="Times New Roman"/>
+                <w:b w:val="false"/>
+                <w:bCs w:val="false"/>
+                <w:sz w:val="24"/>
+                <w:szCs w:val="24"/>
+              </w:rPr>
+              <w:t xml:space="preserve">6% loss, 60 ms</w:t>
+            </w:r>
+          </w:p>
+        </w:tc>
+        <w:tc>
+          <w:tcPr>
+            <w:tcW w:type="dxa" w:w="1500"/>
+            <w:tcBorders>
+              <w:top w:val="single" w:color="000000" w:sz="4"/>
+              <w:left w:val="single" w:color="000000" w:sz="4"/>
+              <w:bottom w:val="single" w:color="000000" w:sz="4"/>
+              <w:right w:val="single" w:color="000000" w:sz="4"/>
+            </w:tcBorders>
+            <w:tcMar>
+              <w:top w:type="dxa" w:w="60"/>
+              <w:left w:type="dxa" w:w="100"/>
+              <w:bottom w:type="dxa" w:w="60"/>
+              <w:right w:type="dxa" w:w="100"/>
+            </w:tcMar>
+          </w:tcPr>
+          <w:p>
+            <w:pPr>
+              <w:spacing w:line="276"/>
+              <w:jc w:val="left"/>
+            </w:pPr>
+            <w:r>
+              <w:rPr>
+                <w:rFonts w:ascii="Times New Roman" w:cs="Times New Roman" w:eastAsia="Times New Roman" w:hAnsi="Times New Roman"/>
+                <w:b w:val="false"/>
+                <w:bCs w:val="false"/>
+                <w:sz w:val="24"/>
+                <w:szCs w:val="24"/>
+              </w:rPr>
+              <w:t xml:space="preserve">1.34 s</w:t>
+            </w:r>
+          </w:p>
+        </w:tc>
+        <w:tc>
+          <w:tcPr>
+            <w:tcW w:type="dxa" w:w="1500"/>
+            <w:tcBorders>
+              <w:top w:val="single" w:color="000000" w:sz="4"/>
+              <w:left w:val="single" w:color="000000" w:sz="4"/>
+              <w:bottom w:val="single" w:color="000000" w:sz="4"/>
+              <w:right w:val="single" w:color="000000" w:sz="4"/>
+            </w:tcBorders>
+            <w:tcMar>
+              <w:top w:type="dxa" w:w="60"/>
+              <w:left w:type="dxa" w:w="100"/>
+              <w:bottom w:type="dxa" w:w="60"/>
+              <w:right w:type="dxa" w:w="100"/>
+            </w:tcMar>
+          </w:tcPr>
+          <w:p>
+            <w:pPr>
+              <w:spacing w:line="276"/>
+              <w:jc w:val="left"/>
+            </w:pPr>
+            <w:r>
+              <w:rPr>
+                <w:rFonts w:ascii="Times New Roman" w:cs="Times New Roman" w:eastAsia="Times New Roman" w:hAnsi="Times New Roman"/>
+                <w:b w:val="false"/>
+                <w:bCs w:val="false"/>
+                <w:sz w:val="24"/>
+                <w:szCs w:val="24"/>
+              </w:rPr>
+              <w:t xml:space="preserve">1.81 s</w:t>
+            </w:r>
+          </w:p>
+        </w:tc>
+        <w:tc>
+          <w:tcPr>
+            <w:tcW w:type="dxa" w:w="1600"/>
+            <w:tcBorders>
+              <w:top w:val="single" w:color="000000" w:sz="4"/>
+              <w:left w:val="single" w:color="000000" w:sz="4"/>
+              <w:bottom w:val="single" w:color="000000" w:sz="4"/>
+              <w:right w:val="single" w:color="000000" w:sz="4"/>
+            </w:tcBorders>
+            <w:tcMar>
+              <w:top w:type="dxa" w:w="60"/>
+              <w:left w:type="dxa" w:w="100"/>
+              <w:bottom w:type="dxa" w:w="60"/>
+              <w:right w:type="dxa" w:w="100"/>
+            </w:tcMar>
+          </w:tcPr>
+          <w:p>
+            <w:pPr>
+              <w:spacing w:line="276"/>
+              <w:jc w:val="left"/>
+            </w:pPr>
+            <w:r>
+              <w:rPr>
+                <w:rFonts w:ascii="Times New Roman" w:cs="Times New Roman" w:eastAsia="Times New Roman" w:hAnsi="Times New Roman"/>
+                <w:b w:val="false"/>
+                <w:bCs w:val="false"/>
+                <w:sz w:val="24"/>
+                <w:szCs w:val="24"/>
+              </w:rPr>
+              <w:t xml:space="preserve">1.08 s</w:t>
+            </w:r>
+          </w:p>
+        </w:tc>
+        <w:tc>
+          <w:tcPr>
+            <w:tcW w:type="dxa" w:w="1326"/>
+            <w:tcBorders>
+              <w:top w:val="single" w:color="000000" w:sz="4"/>
+              <w:left w:val="single" w:color="000000" w:sz="4"/>
+              <w:bottom w:val="single" w:color="000000" w:sz="4"/>
+              <w:right w:val="single" w:color="000000" w:sz="4"/>
+            </w:tcBorders>
+            <w:tcMar>
+              <w:top w:type="dxa" w:w="60"/>
+              <w:left w:type="dxa" w:w="100"/>
+              <w:bottom w:type="dxa" w:w="60"/>
+              <w:right w:type="dxa" w:w="100"/>
+            </w:tcMar>
+          </w:tcPr>
+          <w:p>
+            <w:pPr>
+              <w:spacing w:line="276"/>
+              <w:jc w:val="left"/>
+            </w:pPr>
+            <w:r>
+              <w:rPr>
+                <w:rFonts w:ascii="Times New Roman" w:cs="Times New Roman" w:eastAsia="Times New Roman" w:hAnsi="Times New Roman"/>
+                <w:b w:val="false"/>
+                <w:bCs w:val="false"/>
+                <w:sz w:val="24"/>
+                <w:szCs w:val="24"/>
+              </w:rPr>
+              <w:t xml:space="preserve">faster</w:t>
+            </w:r>
+          </w:p>
+        </w:tc>
+      </w:tr>
+      <w:tr>
+        <w:trPr>
+          <w:cantSplit/>
+          <w:tblHeader w:val="false"/>
+        </w:trPr>
+        <w:tc>
+          <w:tcPr>
+            <w:tcW w:type="dxa" w:w="3100"/>
+            <w:tcBorders>
+              <w:top w:val="single" w:color="000000" w:sz="4"/>
+              <w:left w:val="single" w:color="000000" w:sz="4"/>
+              <w:bottom w:val="single" w:color="000000" w:sz="4"/>
+              <w:right w:val="single" w:color="000000" w:sz="4"/>
+            </w:tcBorders>
+            <w:tcMar>
+              <w:top w:type="dxa" w:w="60"/>
+              <w:left w:type="dxa" w:w="100"/>
+              <w:bottom w:type="dxa" w:w="60"/>
+              <w:right w:type="dxa" w:w="100"/>
+            </w:tcMar>
+          </w:tcPr>
+          <w:p>
+            <w:pPr>
+              <w:spacing w:line="276"/>
+              <w:jc w:val="left"/>
+            </w:pPr>
+            <w:r>
+              <w:rPr>
+                <w:rFonts w:ascii="Times New Roman" w:cs="Times New Roman" w:eastAsia="Times New Roman" w:hAnsi="Times New Roman"/>
+                <w:b w:val="false"/>
+                <w:bCs w:val="false"/>
+                <w:sz w:val="24"/>
+                <w:szCs w:val="24"/>
+              </w:rPr>
+              <w:t xml:space="preserve">4% loss, 50 ms, bottleneck</w:t>
+            </w:r>
+          </w:p>
+        </w:tc>
+        <w:tc>
+          <w:tcPr>
+            <w:tcW w:type="dxa" w:w="1500"/>
+            <w:tcBorders>
+              <w:top w:val="single" w:color="000000" w:sz="4"/>
+              <w:left w:val="single" w:color="000000" w:sz="4"/>
+              <w:bottom w:val="single" w:color="000000" w:sz="4"/>
+              <w:right w:val="single" w:color="000000" w:sz="4"/>
+            </w:tcBorders>
+            <w:tcMar>
+              <w:top w:type="dxa" w:w="60"/>
+              <w:left w:type="dxa" w:w="100"/>
+              <w:bottom w:type="dxa" w:w="60"/>
+              <w:right w:type="dxa" w:w="100"/>
+            </w:tcMar>
+          </w:tcPr>
+          <w:p>
+            <w:pPr>
+              <w:spacing w:line="276"/>
+              <w:jc w:val="left"/>
+            </w:pPr>
+            <w:r>
+              <w:rPr>
+                <w:rFonts w:ascii="Times New Roman" w:cs="Times New Roman" w:eastAsia="Times New Roman" w:hAnsi="Times New Roman"/>
+                <w:b w:val="false"/>
+                <w:bCs w:val="false"/>
+                <w:sz w:val="24"/>
+                <w:szCs w:val="24"/>
+              </w:rPr>
+              <w:t xml:space="preserve">1.30 s</w:t>
+            </w:r>
+          </w:p>
+        </w:tc>
+        <w:tc>
+          <w:tcPr>
+            <w:tcW w:type="dxa" w:w="1500"/>
+            <w:tcBorders>
+              <w:top w:val="single" w:color="000000" w:sz="4"/>
+              <w:left w:val="single" w:color="000000" w:sz="4"/>
+              <w:bottom w:val="single" w:color="000000" w:sz="4"/>
+              <w:right w:val="single" w:color="000000" w:sz="4"/>
+            </w:tcBorders>
+            <w:tcMar>
+              <w:top w:type="dxa" w:w="60"/>
+              <w:left w:type="dxa" w:w="100"/>
+              <w:bottom w:type="dxa" w:w="60"/>
+              <w:right w:type="dxa" w:w="100"/>
+            </w:tcMar>
+          </w:tcPr>
+          <w:p>
+            <w:pPr>
+              <w:spacing w:line="276"/>
+              <w:jc w:val="left"/>
+            </w:pPr>
+            <w:r>
+              <w:rPr>
+                <w:rFonts w:ascii="Times New Roman" w:cs="Times New Roman" w:eastAsia="Times New Roman" w:hAnsi="Times New Roman"/>
+                <w:b w:val="false"/>
+                <w:bCs w:val="false"/>
+                <w:sz w:val="24"/>
+                <w:szCs w:val="24"/>
+              </w:rPr>
+              <w:t xml:space="preserve">1.55 s</w:t>
+            </w:r>
+          </w:p>
+        </w:tc>
+        <w:tc>
+          <w:tcPr>
+            <w:tcW w:type="dxa" w:w="1600"/>
+            <w:tcBorders>
+              <w:top w:val="single" w:color="000000" w:sz="4"/>
+              <w:left w:val="single" w:color="000000" w:sz="4"/>
+              <w:bottom w:val="single" w:color="000000" w:sz="4"/>
+              <w:right w:val="single" w:color="000000" w:sz="4"/>
+            </w:tcBorders>
+            <w:tcMar>
+              <w:top w:type="dxa" w:w="60"/>
+              <w:left w:type="dxa" w:w="100"/>
+              <w:bottom w:type="dxa" w:w="60"/>
+              <w:right w:type="dxa" w:w="100"/>
+            </w:tcMar>
+          </w:tcPr>
+          <w:p>
+            <w:pPr>
+              <w:spacing w:line="276"/>
+              <w:jc w:val="left"/>
+            </w:pPr>
+            <w:r>
+              <w:rPr>
+                <w:rFonts w:ascii="Times New Roman" w:cs="Times New Roman" w:eastAsia="Times New Roman" w:hAnsi="Times New Roman"/>
+                <w:b w:val="false"/>
+                <w:bCs w:val="false"/>
+                <w:sz w:val="24"/>
+                <w:szCs w:val="24"/>
+              </w:rPr>
+              <w:t xml:space="preserve">1.37 s</w:t>
+            </w:r>
+          </w:p>
+        </w:tc>
+        <w:tc>
+          <w:tcPr>
+            <w:tcW w:type="dxa" w:w="1326"/>
+            <w:tcBorders>
+              <w:top w:val="single" w:color="000000" w:sz="4"/>
+              <w:left w:val="single" w:color="000000" w:sz="4"/>
+              <w:bottom w:val="single" w:color="000000" w:sz="4"/>
+              <w:right w:val="single" w:color="000000" w:sz="4"/>
+            </w:tcBorders>
+            <w:tcMar>
+              <w:top w:type="dxa" w:w="60"/>
+              <w:left w:type="dxa" w:w="100"/>
+              <w:bottom w:type="dxa" w:w="60"/>
+              <w:right w:type="dxa" w:w="100"/>
+            </w:tcMar>
+          </w:tcPr>
+          <w:p>
+            <w:pPr>
+              <w:spacing w:line="276"/>
+              <w:jc w:val="left"/>
+            </w:pPr>
+            <w:r>
+              <w:rPr>
+                <w:rFonts w:ascii="Times New Roman" w:cs="Times New Roman" w:eastAsia="Times New Roman" w:hAnsi="Times New Roman"/>
+                <w:b w:val="false"/>
+                <w:bCs w:val="false"/>
+                <w:sz w:val="24"/>
+                <w:szCs w:val="24"/>
+              </w:rPr>
+              <w:t xml:space="preserve">faster (marginal)</w:t>
+            </w:r>
+          </w:p>
+        </w:tc>
+      </w:tr>
+      <w:tr>
+        <w:trPr>
+          <w:cantSplit/>
+          <w:tblHeader w:val="false"/>
+        </w:trPr>
+        <w:tc>
+          <w:tcPr>
+            <w:tcW w:type="dxa" w:w="3100"/>
+            <w:tcBorders>
+              <w:top w:val="single" w:color="000000" w:sz="4"/>
+              <w:left w:val="single" w:color="000000" w:sz="4"/>
+              <w:bottom w:val="single" w:color="000000" w:sz="4"/>
+              <w:right w:val="single" w:color="000000" w:sz="4"/>
+            </w:tcBorders>
+            <w:tcMar>
+              <w:top w:type="dxa" w:w="60"/>
+              <w:left w:type="dxa" w:w="100"/>
+              <w:bottom w:type="dxa" w:w="60"/>
+              <w:right w:type="dxa" w:w="100"/>
+            </w:tcMar>
+          </w:tcPr>
+          <w:p>
+            <w:pPr>
+              <w:spacing w:line="276"/>
+              <w:jc w:val="left"/>
+            </w:pPr>
+            <w:r>
+              <w:rPr>
+                <w:rFonts w:ascii="Times New Roman" w:cs="Times New Roman" w:eastAsia="Times New Roman" w:hAnsi="Times New Roman"/>
+                <w:b w:val="false"/>
+                <w:bCs w:val="false"/>
+                <w:sz w:val="24"/>
+                <w:szCs w:val="24"/>
+              </w:rPr>
+              <w:t xml:space="preserve">No loss, 30 ms, bottleneck</w:t>
+            </w:r>
+          </w:p>
+        </w:tc>
+        <w:tc>
+          <w:tcPr>
+            <w:tcW w:type="dxa" w:w="1500"/>
+            <w:tcBorders>
+              <w:top w:val="single" w:color="000000" w:sz="4"/>
+              <w:left w:val="single" w:color="000000" w:sz="4"/>
+              <w:bottom w:val="single" w:color="000000" w:sz="4"/>
+              <w:right w:val="single" w:color="000000" w:sz="4"/>
+            </w:tcBorders>
+            <w:tcMar>
+              <w:top w:type="dxa" w:w="60"/>
+              <w:left w:type="dxa" w:w="100"/>
+              <w:bottom w:type="dxa" w:w="60"/>
+              <w:right w:type="dxa" w:w="100"/>
+            </w:tcMar>
+          </w:tcPr>
+          <w:p>
+            <w:pPr>
+              <w:spacing w:line="276"/>
+              <w:jc w:val="left"/>
+            </w:pPr>
+            <w:r>
+              <w:rPr>
+                <w:rFonts w:ascii="Times New Roman" w:cs="Times New Roman" w:eastAsia="Times New Roman" w:hAnsi="Times New Roman"/>
+                <w:b w:val="false"/>
+                <w:bCs w:val="false"/>
+                <w:sz w:val="24"/>
+                <w:szCs w:val="24"/>
+              </w:rPr>
+              <w:t xml:space="preserve">0.61 s</w:t>
+            </w:r>
+          </w:p>
+        </w:tc>
+        <w:tc>
+          <w:tcPr>
+            <w:tcW w:type="dxa" w:w="1500"/>
+            <w:tcBorders>
+              <w:top w:val="single" w:color="000000" w:sz="4"/>
+              <w:left w:val="single" w:color="000000" w:sz="4"/>
+              <w:bottom w:val="single" w:color="000000" w:sz="4"/>
+              <w:right w:val="single" w:color="000000" w:sz="4"/>
+            </w:tcBorders>
+            <w:tcMar>
+              <w:top w:type="dxa" w:w="60"/>
+              <w:left w:type="dxa" w:w="100"/>
+              <w:bottom w:type="dxa" w:w="60"/>
+              <w:right w:type="dxa" w:w="100"/>
+            </w:tcMar>
+          </w:tcPr>
+          <w:p>
+            <w:pPr>
+              <w:spacing w:line="276"/>
+              <w:jc w:val="left"/>
+            </w:pPr>
+            <w:r>
+              <w:rPr>
+                <w:rFonts w:ascii="Times New Roman" w:cs="Times New Roman" w:eastAsia="Times New Roman" w:hAnsi="Times New Roman"/>
+                <w:b w:val="false"/>
+                <w:bCs w:val="false"/>
+                <w:sz w:val="24"/>
+                <w:szCs w:val="24"/>
+              </w:rPr>
+              <w:t xml:space="preserve">0.56 s</w:t>
+            </w:r>
+          </w:p>
+        </w:tc>
+        <w:tc>
+          <w:tcPr>
+            <w:tcW w:type="dxa" w:w="1600"/>
+            <w:tcBorders>
+              <w:top w:val="single" w:color="000000" w:sz="4"/>
+              <w:left w:val="single" w:color="000000" w:sz="4"/>
+              <w:bottom w:val="single" w:color="000000" w:sz="4"/>
+              <w:right w:val="single" w:color="000000" w:sz="4"/>
+            </w:tcBorders>
+            <w:tcMar>
+              <w:top w:type="dxa" w:w="60"/>
+              <w:left w:type="dxa" w:w="100"/>
+              <w:bottom w:type="dxa" w:w="60"/>
+              <w:right w:type="dxa" w:w="100"/>
+            </w:tcMar>
+          </w:tcPr>
+          <w:p>
+            <w:pPr>
+              <w:spacing w:line="276"/>
+              <w:jc w:val="left"/>
+            </w:pPr>
+            <w:r>
+              <w:rPr>
+                <w:rFonts w:ascii="Times New Roman" w:cs="Times New Roman" w:eastAsia="Times New Roman" w:hAnsi="Times New Roman"/>
+                <w:b w:val="false"/>
+                <w:bCs w:val="false"/>
+                <w:sz w:val="24"/>
+                <w:szCs w:val="24"/>
+              </w:rPr>
+              <w:t xml:space="preserve">0.56 s</w:t>
+            </w:r>
+          </w:p>
+        </w:tc>
+        <w:tc>
+          <w:tcPr>
+            <w:tcW w:type="dxa" w:w="1326"/>
+            <w:tcBorders>
+              <w:top w:val="single" w:color="000000" w:sz="4"/>
+              <w:left w:val="single" w:color="000000" w:sz="4"/>
+              <w:bottom w:val="single" w:color="000000" w:sz="4"/>
+              <w:right w:val="single" w:color="000000" w:sz="4"/>
+            </w:tcBorders>
+            <w:tcMar>
+              <w:top w:type="dxa" w:w="60"/>
+              <w:left w:type="dxa" w:w="100"/>
+              <w:bottom w:type="dxa" w:w="60"/>
+              <w:right w:type="dxa" w:w="100"/>
+            </w:tcMar>
+          </w:tcPr>
+          <w:p>
+            <w:pPr>
+              <w:spacing w:line="276"/>
+              <w:jc w:val="left"/>
+            </w:pPr>
+            <w:r>
+              <w:rPr>
+                <w:rFonts w:ascii="Times New Roman" w:cs="Times New Roman" w:eastAsia="Times New Roman" w:hAnsi="Times New Roman"/>
+                <w:b w:val="false"/>
+                <w:bCs w:val="false"/>
+                <w:sz w:val="24"/>
+                <w:szCs w:val="24"/>
+              </w:rPr>
+              <w:t xml:space="preserve">equal</w:t>
+            </w:r>
+          </w:p>
+        </w:tc>
+      </w:tr>
+      <w:tr>
+        <w:trPr>
+          <w:cantSplit/>
+          <w:tblHeader w:val="false"/>
+        </w:trPr>
+        <w:tc>
+          <w:tcPr>
+            <w:tcW w:type="dxa" w:w="3100"/>
+            <w:tcBorders>
+              <w:top w:val="single" w:color="000000" w:sz="4"/>
+              <w:left w:val="single" w:color="000000" w:sz="4"/>
+              <w:bottom w:val="single" w:color="000000" w:sz="4"/>
+              <w:right w:val="single" w:color="000000" w:sz="4"/>
+            </w:tcBorders>
+            <w:tcMar>
+              <w:top w:type="dxa" w:w="60"/>
+              <w:left w:type="dxa" w:w="100"/>
+              <w:bottom w:type="dxa" w:w="60"/>
+              <w:right w:type="dxa" w:w="100"/>
+            </w:tcMar>
+          </w:tcPr>
+          <w:p>
+            <w:pPr>
+              <w:spacing w:line="276"/>
+              <w:jc w:val="left"/>
+            </w:pPr>
+            <w:r>
+              <w:rPr>
+                <w:rFonts w:ascii="Times New Roman" w:cs="Times New Roman" w:eastAsia="Times New Roman" w:hAnsi="Times New Roman"/>
+                <w:b w:val="false"/>
+                <w:bCs w:val="false"/>
+                <w:sz w:val="24"/>
+                <w:szCs w:val="24"/>
+              </w:rPr>
+              <w:t xml:space="preserve">14% loss, 90 ms</w:t>
+            </w:r>
+          </w:p>
+        </w:tc>
+        <w:tc>
+          <w:tcPr>
+            <w:tcW w:type="dxa" w:w="1500"/>
+            <w:tcBorders>
+              <w:top w:val="single" w:color="000000" w:sz="4"/>
+              <w:left w:val="single" w:color="000000" w:sz="4"/>
+              <w:bottom w:val="single" w:color="000000" w:sz="4"/>
+              <w:right w:val="single" w:color="000000" w:sz="4"/>
+            </w:tcBorders>
+            <w:tcMar>
+              <w:top w:type="dxa" w:w="60"/>
+              <w:left w:type="dxa" w:w="100"/>
+              <w:bottom w:type="dxa" w:w="60"/>
+              <w:right w:type="dxa" w:w="100"/>
+            </w:tcMar>
+          </w:tcPr>
+          <w:p>
+            <w:pPr>
+              <w:spacing w:line="276"/>
+              <w:jc w:val="left"/>
+            </w:pPr>
+            <w:r>
+              <w:rPr>
+                <w:rFonts w:ascii="Times New Roman" w:cs="Times New Roman" w:eastAsia="Times New Roman" w:hAnsi="Times New Roman"/>
+                <w:b w:val="false"/>
+                <w:bCs w:val="false"/>
+                <w:sz w:val="24"/>
+                <w:szCs w:val="24"/>
+              </w:rPr>
+              <w:t xml:space="preserve">2.21 s</w:t>
+            </w:r>
+          </w:p>
+        </w:tc>
+        <w:tc>
+          <w:tcPr>
+            <w:tcW w:type="dxa" w:w="1500"/>
+            <w:tcBorders>
+              <w:top w:val="single" w:color="000000" w:sz="4"/>
+              <w:left w:val="single" w:color="000000" w:sz="4"/>
+              <w:bottom w:val="single" w:color="000000" w:sz="4"/>
+              <w:right w:val="single" w:color="000000" w:sz="4"/>
+            </w:tcBorders>
+            <w:tcMar>
+              <w:top w:type="dxa" w:w="60"/>
+              <w:left w:type="dxa" w:w="100"/>
+              <w:bottom w:type="dxa" w:w="60"/>
+              <w:right w:type="dxa" w:w="100"/>
+            </w:tcMar>
+          </w:tcPr>
+          <w:p>
+            <w:pPr>
+              <w:spacing w:line="276"/>
+              <w:jc w:val="left"/>
+            </w:pPr>
+            <w:r>
+              <w:rPr>
+                <w:rFonts w:ascii="Times New Roman" w:cs="Times New Roman" w:eastAsia="Times New Roman" w:hAnsi="Times New Roman"/>
+                <w:b w:val="false"/>
+                <w:bCs w:val="false"/>
+                <w:sz w:val="24"/>
+                <w:szCs w:val="24"/>
+              </w:rPr>
+              <w:t xml:space="preserve">4.89 s</w:t>
+            </w:r>
+          </w:p>
+        </w:tc>
+        <w:tc>
+          <w:tcPr>
+            <w:tcW w:type="dxa" w:w="1600"/>
+            <w:tcBorders>
+              <w:top w:val="single" w:color="000000" w:sz="4"/>
+              <w:left w:val="single" w:color="000000" w:sz="4"/>
+              <w:bottom w:val="single" w:color="000000" w:sz="4"/>
+              <w:right w:val="single" w:color="000000" w:sz="4"/>
+            </w:tcBorders>
+            <w:tcMar>
+              <w:top w:type="dxa" w:w="60"/>
+              <w:left w:type="dxa" w:w="100"/>
+              <w:bottom w:type="dxa" w:w="60"/>
+              <w:right w:type="dxa" w:w="100"/>
+            </w:tcMar>
+          </w:tcPr>
+          <w:p>
+            <w:pPr>
+              <w:spacing w:line="276"/>
+              <w:jc w:val="left"/>
+            </w:pPr>
+            <w:r>
+              <w:rPr>
+                <w:rFonts w:ascii="Times New Roman" w:cs="Times New Roman" w:eastAsia="Times New Roman" w:hAnsi="Times New Roman"/>
+                <w:b w:val="false"/>
+                <w:bCs w:val="false"/>
+                <w:sz w:val="24"/>
+                <w:szCs w:val="24"/>
+              </w:rPr>
+              <w:t xml:space="preserve">1.85 s</w:t>
+            </w:r>
+          </w:p>
+        </w:tc>
+        <w:tc>
+          <w:tcPr>
+            <w:tcW w:type="dxa" w:w="1326"/>
+            <w:tcBorders>
+              <w:top w:val="single" w:color="000000" w:sz="4"/>
+              <w:left w:val="single" w:color="000000" w:sz="4"/>
+              <w:bottom w:val="single" w:color="000000" w:sz="4"/>
+              <w:right w:val="single" w:color="000000" w:sz="4"/>
+            </w:tcBorders>
+            <w:tcMar>
+              <w:top w:type="dxa" w:w="60"/>
+              <w:left w:type="dxa" w:w="100"/>
+              <w:bottom w:type="dxa" w:w="60"/>
+              <w:right w:type="dxa" w:w="100"/>
+            </w:tcMar>
+          </w:tcPr>
+          <w:p>
+            <w:pPr>
+              <w:spacing w:line="276"/>
+              <w:jc w:val="left"/>
+            </w:pPr>
+            <w:r>
+              <w:rPr>
+                <w:rFonts w:ascii="Times New Roman" w:cs="Times New Roman" w:eastAsia="Times New Roman" w:hAnsi="Times New Roman"/>
+                <w:b w:val="false"/>
+                <w:bCs w:val="false"/>
+                <w:sz w:val="24"/>
+                <w:szCs w:val="24"/>
+              </w:rPr>
+              <w:t xml:space="preserve">faster</w:t>
+            </w:r>
+          </w:p>
+        </w:tc>
+      </w:tr>
+    </w:tbl>
+    <w:p>
+      <w:pPr>
+        <w:spacing w:after="160"/>
+      </w:pPr>
+    </w:p>
+    <w:p>
+      <w:pPr>
+        <w:spacing w:after="120" w:line="360"/>
+        <w:jc w:val="both"/>
+      </w:pPr>
+      <w:r>
+        <w:rPr>
+          <w:rFonts w:ascii="Times New Roman" w:cs="Times New Roman" w:eastAsia="Times New Roman" w:hAnsi="Times New Roman"/>
+          <w:sz w:val="24"/>
+          <w:szCs w:val="24"/>
+        </w:rPr>
+        <w:t xml:space="preserve">Smart-RUDP was faster than AIMD on five of the six paths and equal on the sixth, and faster than the fixed window on five paths. The reason is specific: AIMD resets its window to one packet after every timeout, which is expensive when loss is random and not caused by congestion, while the agent learned to hold its window in that case. The advantage is therefore largest on high-loss paths and absent on a clean bottleneck, where there is nothing to learn. These are simulated paths. A real-time check of the gateway with two copies on one machine (four runs per controller) gave a mean of 1.2 s for Smart-RUDP against 2.6 s for AIMD at 10% loss and 40 ms, and 2.3 s against 3.0 s at 2% loss and 100 ms, with the fixed window at 0.8 s and 1.8 s; the run-to-run spread there is large, so those numbers support the direction and not the size of the effect. Section 8 stands as reported: on the 5G-like, lossy and satellite-like paths of that experiment the learned controller did not beat AIMD. </w:t>
+      </w:r>
+    </w:p>
+    <w:p>
+      <w:pPr>
+        <w:spacing w:after="120" w:line="360"/>
+        <w:jc w:val="both"/>
+      </w:pPr>
+      <w:r>
+        <w:rPr>
+          <w:rFonts w:ascii="Times New Roman" w:cs="Times New Roman" w:eastAsia="Times New Roman" w:hAnsi="Times New Roman"/>
+          <w:sz w:val="24"/>
+          <w:szCs w:val="24"/>
+        </w:rPr>
+        <w:t xml:space="preserve">This demonstration is an application of the protocol, not a new measurement. Over the internet the result also depends on the network between the peers: direct connections between two home networks usually work, but shared or carrier-grade NAT, as on many hostel networks, can block them, which is why the private-network route was used.</w:t>
       </w:r>
     </w:p>
     <w:p>

</xml_diff>